<commit_message>
Report §3: sync embedded reproducer with the committed offline SilentDropRepro
The defect report's §3 still embedded the old network-based reproducer
(connected to cloudflare.com:443). Replace it with the current committed
src/SilentDropRepro.java verbatim (fully offline: SSLContext.getDefault +
SSLEngine.wrap produces the ClientHello in memory, no server/network), and
update the §3 caption to describe the offline design. All §4 verbatim
traces, the results matrix, and every other section are unchanged; the
JDK-27 drop remains correctly attributed to MLKEM768, not X25519MLKEM768.
</commit_message>
<xml_diff>
--- a/report/JSSE-NamedGroup-Silent-Drop-Report.docx
+++ b/report/JSSE-NamedGroup-Silent-Drop-Report.docx
@@ -487,7 +487,7 @@
           <w:i w:val="0"/>
           <w:sz w:val="21"/>
         </w:rPr>
-        <w:t>Single file, stock JDK only, no dependencies, one command:  java SilentDropRepro.java   (on JDK 27 EA also:  java SilentDropRepro.java MLKEM768,x25519 ). Add -Djavax.net.debug=ssl:handshake to see the trace lines in Section 4.</w:t>
+        <w:t xml:space="preserve">Single file, stock JDK 21+, fully offline — no server, no network, no keystore, no dependencies. It requests the groups, produces a ClientHello entirely in memory via SSLEngine, runs the setEnabledProtocols("TLSv9.9") control, and prints an explicit verdict. One command:  java SilentDropRepro.java   (also:  java SilentDropRepro.java MLKEM768,x25519 — still silently dropped on JDK 27 EA). Add -Djavax.net.debug=ssl:handshake to see the trace line in Section 4.</w:t>
       </w:r>
     </w:p>
     <w:p>
@@ -501,7 +501,266 @@
           <w:rFonts w:ascii="Consolas" w:hAnsi="Consolas" w:cs="Consolas"/>
           <w:sz w:val="15"/>
         </w:rPr>
-        <w:t>public class SilentDropRepro {</w:t>
+        <w:t xml:space="preserve">import javax.net.ssl.*;</w:t>
+      </w:r>
+    </w:p>
+    <w:p>
+      <w:pPr>
+        <w:spacing w:after="0"/>
+        <w:ind w:left="173" w:right="173"/>
+        <w:shd w:val="clear" w:fill="F3F3F3"/>
+      </w:pPr>
+      <w:r>
+        <w:rPr>
+          <w:rFonts w:ascii="Consolas" w:hAnsi="Consolas" w:cs="Consolas"/>
+          <w:sz w:val="15"/>
+        </w:rPr>
+        <w:t xml:space="preserve">import java.nio.ByteBuffer;</w:t>
+      </w:r>
+    </w:p>
+    <w:p>
+      <w:pPr>
+        <w:spacing w:after="0"/>
+        <w:ind w:left="173" w:right="173"/>
+        <w:shd w:val="clear" w:fill="F3F3F3"/>
+      </w:pPr>
+      <w:r>
+        <w:rPr>
+          <w:rFonts w:ascii="Consolas" w:hAnsi="Consolas" w:cs="Consolas"/>
+          <w:sz w:val="15"/>
+        </w:rPr>
+        <w:t xml:space="preserve">import java.util.*;</w:t>
+      </w:r>
+    </w:p>
+    <w:p>
+      <w:pPr>
+        <w:spacing w:after="0"/>
+        <w:ind w:left="173" w:right="173"/>
+        <w:shd w:val="clear" w:fill="F3F3F3"/>
+      </w:pPr>
+    </w:p>
+    <w:p>
+      <w:pPr>
+        <w:spacing w:after="0"/>
+        <w:ind w:left="173" w:right="173"/>
+        <w:shd w:val="clear" w:fill="F3F3F3"/>
+      </w:pPr>
+      <w:r>
+        <w:rPr>
+          <w:rFonts w:ascii="Consolas" w:hAnsi="Consolas" w:cs="Consolas"/>
+          <w:sz w:val="15"/>
+        </w:rPr>
+        <w:t xml:space="preserve">/**</w:t>
+      </w:r>
+    </w:p>
+    <w:p>
+      <w:pPr>
+        <w:spacing w:after="0"/>
+        <w:ind w:left="173" w:right="173"/>
+        <w:shd w:val="clear" w:fill="F3F3F3"/>
+      </w:pPr>
+      <w:r>
+        <w:rPr>
+          <w:rFonts w:ascii="Consolas" w:hAnsi="Consolas" w:cs="Consolas"/>
+          <w:sz w:val="15"/>
+        </w:rPr>
+        <w:t xml:space="preserve"> * Minimal reproducer, fully offline (no server, no network, no dependencies):</w:t>
+      </w:r>
+    </w:p>
+    <w:p>
+      <w:pPr>
+        <w:spacing w:after="0"/>
+        <w:ind w:left="173" w:right="173"/>
+        <w:shd w:val="clear" w:fill="F3F3F3"/>
+      </w:pPr>
+      <w:r>
+        <w:rPr>
+          <w:rFonts w:ascii="Consolas" w:hAnsi="Consolas" w:cs="Consolas"/>
+          <w:sz w:val="15"/>
+        </w:rPr>
+        <w:t xml:space="preserve"> * SSLParameters.setNamedGroups() silently accepts named groups the provider</w:t>
+      </w:r>
+    </w:p>
+    <w:p>
+      <w:pPr>
+        <w:spacing w:after="0"/>
+        <w:ind w:left="173" w:right="173"/>
+        <w:shd w:val="clear" w:fill="F3F3F3"/>
+      </w:pPr>
+      <w:r>
+        <w:rPr>
+          <w:rFonts w:ascii="Consolas" w:hAnsi="Consolas" w:cs="Consolas"/>
+          <w:sz w:val="15"/>
+        </w:rPr>
+        <w:t xml:space="preserve"> * does not support and drops them from the ClientHello -- no exception, no</w:t>
+      </w:r>
+    </w:p>
+    <w:p>
+      <w:pPr>
+        <w:spacing w:after="0"/>
+        <w:ind w:left="173" w:right="173"/>
+        <w:shd w:val="clear" w:fill="F3F3F3"/>
+      </w:pPr>
+      <w:r>
+        <w:rPr>
+          <w:rFonts w:ascii="Consolas" w:hAnsi="Consolas" w:cs="Consolas"/>
+          <w:sz w:val="15"/>
+        </w:rPr>
+        <w:t xml:space="preserve"> * warning, no public API to detect it. By contrast, an unsupported PROTOCOL</w:t>
+      </w:r>
+    </w:p>
+    <w:p>
+      <w:pPr>
+        <w:spacing w:after="0"/>
+        <w:ind w:left="173" w:right="173"/>
+        <w:shd w:val="clear" w:fill="F3F3F3"/>
+      </w:pPr>
+      <w:r>
+        <w:rPr>
+          <w:rFonts w:ascii="Consolas" w:hAnsi="Consolas" w:cs="Consolas"/>
+          <w:sz w:val="15"/>
+        </w:rPr>
+        <w:t xml:space="preserve"> * name on the same parameter object throws IllegalArgumentException at once.</w:t>
+      </w:r>
+    </w:p>
+    <w:p>
+      <w:pPr>
+        <w:spacing w:after="0"/>
+        <w:ind w:left="173" w:right="173"/>
+        <w:shd w:val="clear" w:fill="F3F3F3"/>
+      </w:pPr>
+      <w:r>
+        <w:rPr>
+          <w:rFonts w:ascii="Consolas" w:hAnsi="Consolas" w:cs="Consolas"/>
+          <w:sz w:val="15"/>
+        </w:rPr>
+        <w:t xml:space="preserve"> *</w:t>
+      </w:r>
+    </w:p>
+    <w:p>
+      <w:pPr>
+        <w:spacing w:after="0"/>
+        <w:ind w:left="173" w:right="173"/>
+        <w:shd w:val="clear" w:fill="F3F3F3"/>
+      </w:pPr>
+      <w:r>
+        <w:rPr>
+          <w:rFonts w:ascii="Consolas" w:hAnsi="Consolas" w:cs="Consolas"/>
+          <w:sz w:val="15"/>
+        </w:rPr>
+        <w:t xml:space="preserve"> * Run (one command, stock JDK 21+):</w:t>
+      </w:r>
+    </w:p>
+    <w:p>
+      <w:pPr>
+        <w:spacing w:after="0"/>
+        <w:ind w:left="173" w:right="173"/>
+        <w:shd w:val="clear" w:fill="F3F3F3"/>
+      </w:pPr>
+      <w:r>
+        <w:rPr>
+          <w:rFonts w:ascii="Consolas" w:hAnsi="Consolas" w:cs="Consolas"/>
+          <w:sz w:val="15"/>
+        </w:rPr>
+        <w:t xml:space="preserve"> *   java src/SilentDropRepro.java                        # groups: X25519MLKEM768,x25519</w:t>
+      </w:r>
+    </w:p>
+    <w:p>
+      <w:pPr>
+        <w:spacing w:after="0"/>
+        <w:ind w:left="173" w:right="173"/>
+        <w:shd w:val="clear" w:fill="F3F3F3"/>
+      </w:pPr>
+      <w:r>
+        <w:rPr>
+          <w:rFonts w:ascii="Consolas" w:hAnsi="Consolas" w:cs="Consolas"/>
+          <w:sz w:val="15"/>
+        </w:rPr>
+        <w:t xml:space="preserve"> *   java src/SilentDropRepro.java MLKEM768,x25519        # persists on JDK 27 EA (out of JEP 527 scope)</w:t>
+      </w:r>
+    </w:p>
+    <w:p>
+      <w:pPr>
+        <w:spacing w:after="0"/>
+        <w:ind w:left="173" w:right="173"/>
+        <w:shd w:val="clear" w:fill="F3F3F3"/>
+      </w:pPr>
+      <w:r>
+        <w:rPr>
+          <w:rFonts w:ascii="Consolas" w:hAnsi="Consolas" w:cs="Consolas"/>
+          <w:sz w:val="15"/>
+        </w:rPr>
+        <w:t xml:space="preserve"> *   java src/SilentDropRepro.java NoSuchGroup12345,x25519    # generic, not PQC-specific</w:t>
+      </w:r>
+    </w:p>
+    <w:p>
+      <w:pPr>
+        <w:spacing w:after="0"/>
+        <w:ind w:left="173" w:right="173"/>
+        <w:shd w:val="clear" w:fill="F3F3F3"/>
+      </w:pPr>
+      <w:r>
+        <w:rPr>
+          <w:rFonts w:ascii="Consolas" w:hAnsi="Consolas" w:cs="Consolas"/>
+          <w:sz w:val="15"/>
+        </w:rPr>
+        <w:t xml:space="preserve"> *</w:t>
+      </w:r>
+    </w:p>
+    <w:p>
+      <w:pPr>
+        <w:spacing w:after="0"/>
+        <w:ind w:left="173" w:right="173"/>
+        <w:shd w:val="clear" w:fill="F3F3F3"/>
+      </w:pPr>
+      <w:r>
+        <w:rPr>
+          <w:rFonts w:ascii="Consolas" w:hAnsi="Consolas" w:cs="Consolas"/>
+          <w:sz w:val="15"/>
+        </w:rPr>
+        <w:t xml:space="preserve"> * Add -Djavax.net.debug=ssl:handshake and grep "named group" for the only</w:t>
+      </w:r>
+    </w:p>
+    <w:p>
+      <w:pPr>
+        <w:spacing w:after="0"/>
+        <w:ind w:left="173" w:right="173"/>
+        <w:shd w:val="clear" w:fill="F3F3F3"/>
+      </w:pPr>
+      <w:r>
+        <w:rPr>
+          <w:rFonts w:ascii="Consolas" w:hAnsi="Consolas" w:cs="Consolas"/>
+          <w:sz w:val="15"/>
+        </w:rPr>
+        <w:t xml:space="preserve"> * evidence the JDK ever emits: "Ignore unspecified named group: &lt;name&gt;".</w:t>
+      </w:r>
+    </w:p>
+    <w:p>
+      <w:pPr>
+        <w:spacing w:after="0"/>
+        <w:ind w:left="173" w:right="173"/>
+        <w:shd w:val="clear" w:fill="F3F3F3"/>
+      </w:pPr>
+      <w:r>
+        <w:rPr>
+          <w:rFonts w:ascii="Consolas" w:hAnsi="Consolas" w:cs="Consolas"/>
+          <w:sz w:val="15"/>
+        </w:rPr>
+        <w:t xml:space="preserve"> */</w:t>
+      </w:r>
+    </w:p>
+    <w:p>
+      <w:pPr>
+        <w:spacing w:after="0"/>
+        <w:ind w:left="173" w:right="173"/>
+        <w:shd w:val="clear" w:fill="F3F3F3"/>
+      </w:pPr>
+      <w:r>
+        <w:rPr>
+          <w:rFonts w:ascii="Consolas" w:hAnsi="Consolas" w:cs="Consolas"/>
+          <w:sz w:val="15"/>
+        </w:rPr>
+        <w:t xml:space="preserve">public class SilentDropRepro {</w:t>
       </w:r>
     </w:p>
     <w:p>
@@ -529,8 +788,15 @@
           <w:rFonts w:ascii="Consolas" w:hAnsi="Consolas" w:cs="Consolas"/>
           <w:sz w:val="15"/>
         </w:rPr>
-        <w:t xml:space="preserve">        String[] groups = (args.length &gt; 0 ? args[0] : "X25519MLKEM768,x25519").split(",");</w:t>
+        <w:t xml:space="preserve">        String[] requested = (args.length &gt; 0 ? args[0] : "X25519MLKEM768,x25519").split(",");</w:t>
       </w:r>
+    </w:p>
+    <w:p>
+      <w:pPr>
+        <w:spacing w:after="0"/>
+        <w:ind w:left="173" w:right="173"/>
+        <w:shd w:val="clear" w:fill="F3F3F3"/>
+      </w:pPr>
     </w:p>
     <w:p>
       <w:pPr>
@@ -543,7 +809,7 @@
           <w:rFonts w:ascii="Consolas" w:hAnsi="Consolas" w:cs="Consolas"/>
           <w:sz w:val="15"/>
         </w:rPr>
-        <w:t xml:space="preserve">        String host = args.length &gt; 1 ? args[1] : "cloudflare.com";</w:t>
+        <w:t xml:space="preserve">        SSLContext ctx = SSLContext.getDefault();</w:t>
       </w:r>
     </w:p>
     <w:p>
@@ -557,7 +823,7 @@
           <w:rFonts w:ascii="Consolas" w:hAnsi="Consolas" w:cs="Consolas"/>
           <w:sz w:val="15"/>
         </w:rPr>
-        <w:t xml:space="preserve"> </w:t>
+        <w:t xml:space="preserve">        String[] supported = ctx.getSupportedSSLParameters().getNamedGroups();</w:t>
       </w:r>
     </w:p>
     <w:p>
@@ -571,7 +837,7 @@
           <w:rFonts w:ascii="Consolas" w:hAnsi="Consolas" w:cs="Consolas"/>
           <w:sz w:val="15"/>
         </w:rPr>
-        <w:t xml:space="preserve">        SSLSocketFactory f = (SSLSocketFactory) SSLSocketFactory.getDefault();</w:t>
+        <w:t xml:space="preserve">        System.out.println("JDK:              " + System.getProperty("java.runtime.version"));</w:t>
       </w:r>
     </w:p>
     <w:p>
@@ -585,7 +851,7 @@
           <w:rFonts w:ascii="Consolas" w:hAnsi="Consolas" w:cs="Consolas"/>
           <w:sz w:val="15"/>
         </w:rPr>
-        <w:t xml:space="preserve">        try (SSLSocket s = (SSLSocket) f.createSocket(host, 443)) {</w:t>
+        <w:t xml:space="preserve">        System.out.println("Supported groups: "</w:t>
       </w:r>
     </w:p>
     <w:p>
@@ -599,7 +865,7 @@
           <w:rFonts w:ascii="Consolas" w:hAnsi="Consolas" w:cs="Consolas"/>
           <w:sz w:val="15"/>
         </w:rPr>
-        <w:t xml:space="preserve">            SSLParameters p = s.getSSLParameters();</w:t>
+        <w:t xml:space="preserve">                + (supported == null ? "(null: provider default, not enumerable)" : String.join(",", supported)));</w:t>
       </w:r>
     </w:p>
     <w:p>
@@ -613,8 +879,15 @@
           <w:rFonts w:ascii="Consolas" w:hAnsi="Consolas" w:cs="Consolas"/>
           <w:sz w:val="15"/>
         </w:rPr>
-        <w:t xml:space="preserve">            p.setProtocols(new String[] {"TLSv1.3"});</w:t>
+        <w:t xml:space="preserve">        System.out.println("Requested groups: " + String.join(",", requested));</w:t>
       </w:r>
+    </w:p>
+    <w:p>
+      <w:pPr>
+        <w:spacing w:after="0"/>
+        <w:ind w:left="173" w:right="173"/>
+        <w:shd w:val="clear" w:fill="F3F3F3"/>
+      </w:pPr>
     </w:p>
     <w:p>
       <w:pPr>
@@ -627,7 +900,7 @@
           <w:rFonts w:ascii="Consolas" w:hAnsi="Consolas" w:cs="Consolas"/>
           <w:sz w:val="15"/>
         </w:rPr>
-        <w:t xml:space="preserve">            p.setServerNames(Collections.singletonList(new SNIHostName(host)));</w:t>
+        <w:t xml:space="preserve">        List&lt;String&gt; dropped = new ArrayList&lt;&gt;(List.of(requested));</w:t>
       </w:r>
     </w:p>
     <w:p>
@@ -641,8 +914,15 @@
           <w:rFonts w:ascii="Consolas" w:hAnsi="Consolas" w:cs="Consolas"/>
           <w:sz w:val="15"/>
         </w:rPr>
-        <w:t xml:space="preserve">            p.setNamedGroups(groups);        // application believes this is now the policy</w:t>
+        <w:t xml:space="preserve">        if (supported != null) dropped.removeAll(Arrays.asList(supported));</w:t>
       </w:r>
+    </w:p>
+    <w:p>
+      <w:pPr>
+        <w:spacing w:after="0"/>
+        <w:ind w:left="173" w:right="173"/>
+        <w:shd w:val="clear" w:fill="F3F3F3"/>
+      </w:pPr>
     </w:p>
     <w:p>
       <w:pPr>
@@ -655,7 +935,7 @@
           <w:rFonts w:ascii="Consolas" w:hAnsi="Consolas" w:cs="Consolas"/>
           <w:sz w:val="15"/>
         </w:rPr>
-        <w:t xml:space="preserve">            s.setSSLParameters(p);</w:t>
+        <w:t xml:space="preserve">        // The API under test: request the groups, then produce a ClientHello</w:t>
       </w:r>
     </w:p>
     <w:p>
@@ -669,7 +949,7 @@
           <w:rFonts w:ascii="Consolas" w:hAnsi="Consolas" w:cs="Consolas"/>
           <w:sz w:val="15"/>
         </w:rPr>
-        <w:t xml:space="preserve"> </w:t>
+        <w:t xml:space="preserve">        // entirely in memory via SSLEngine -- no socket is ever opened.</w:t>
       </w:r>
     </w:p>
     <w:p>
@@ -683,7 +963,7 @@
           <w:rFonts w:ascii="Consolas" w:hAnsi="Consolas" w:cs="Consolas"/>
           <w:sz w:val="15"/>
         </w:rPr>
-        <w:t xml:space="preserve">            s.startHandshake();              // no exception, even if groups[0] was dropped</w:t>
+        <w:t xml:space="preserve">        SSLEngine engine = ctx.createSSLEngine();</w:t>
       </w:r>
     </w:p>
     <w:p>
@@ -697,7 +977,7 @@
           <w:rFonts w:ascii="Consolas" w:hAnsi="Consolas" w:cs="Consolas"/>
           <w:sz w:val="15"/>
         </w:rPr>
-        <w:t xml:space="preserve"> </w:t>
+        <w:t xml:space="preserve">        engine.setUseClientMode(true);</w:t>
       </w:r>
     </w:p>
     <w:p>
@@ -711,7 +991,7 @@
           <w:rFonts w:ascii="Consolas" w:hAnsi="Consolas" w:cs="Consolas"/>
           <w:sz w:val="15"/>
         </w:rPr>
-        <w:t xml:space="preserve">            System.out.println("JDK:              " + System.getProperty("java.runtime.version"));</w:t>
+        <w:t xml:space="preserve">        SSLParameters params = engine.getSSLParameters();</w:t>
       </w:r>
     </w:p>
     <w:p>
@@ -725,7 +1005,7 @@
           <w:rFonts w:ascii="Consolas" w:hAnsi="Consolas" w:cs="Consolas"/>
           <w:sz w:val="15"/>
         </w:rPr>
-        <w:t xml:space="preserve">            System.out.println("Requested groups: " + String.join(",", groups));</w:t>
+        <w:t xml:space="preserve">        params.setProtocols(new String[] {"TLSv1.3"});</w:t>
       </w:r>
     </w:p>
     <w:p>
@@ -739,7 +1019,7 @@
           <w:rFonts w:ascii="Consolas" w:hAnsi="Consolas" w:cs="Consolas"/>
           <w:sz w:val="15"/>
         </w:rPr>
-        <w:t xml:space="preserve">            System.out.println("Handshake:        SUCCESS, " + s.getSession().getProtocol()</w:t>
+        <w:t xml:space="preserve">        params.setNamedGroups(requested);                // silently accepts unsupported names</w:t>
       </w:r>
     </w:p>
     <w:p>
@@ -753,7 +1033,7 @@
           <w:rFonts w:ascii="Consolas" w:hAnsi="Consolas" w:cs="Consolas"/>
           <w:sz w:val="15"/>
         </w:rPr>
-        <w:t xml:space="preserve">                    + ", " + s.getSession().getCipherSuite());</w:t>
+        <w:t xml:space="preserve">        engine.setSSLParameters(params);</w:t>
       </w:r>
     </w:p>
     <w:p>
@@ -767,7 +1047,7 @@
           <w:rFonts w:ascii="Consolas" w:hAnsi="Consolas" w:cs="Consolas"/>
           <w:sz w:val="15"/>
         </w:rPr>
-        <w:t xml:space="preserve">            System.out.println("Negotiated named group: NOT OBTAINABLE via any public API.");</w:t>
+        <w:t xml:space="preserve">        System.out.println("setNamedGroups(" + String.join(",", requested) + "): accepted, NO exception");</w:t>
       </w:r>
     </w:p>
     <w:p>
@@ -781,7 +1061,7 @@
           <w:rFonts w:ascii="Consolas" w:hAnsi="Consolas" w:cs="Consolas"/>
           <w:sz w:val="15"/>
         </w:rPr>
-        <w:t xml:space="preserve">            System.out.println("Re-run with -Djavax.net.debug=ssl:handshake and grep for");</w:t>
+        <w:t xml:space="preserve">        System.out.println("getNamedGroups() reads back:  "</w:t>
       </w:r>
     </w:p>
     <w:p>
@@ -795,7 +1075,203 @@
           <w:rFonts w:ascii="Consolas" w:hAnsi="Consolas" w:cs="Consolas"/>
           <w:sz w:val="15"/>
         </w:rPr>
-        <w:t xml:space="preserve">            System.out.println("\"Ignore unspecified named group\" to see which groups were dropped.");</w:t>
+        <w:t xml:space="preserve">                + String.join(",", engine.getSSLParameters().getNamedGroups())</w:t>
+      </w:r>
+    </w:p>
+    <w:p>
+      <w:pPr>
+        <w:spacing w:after="0"/>
+        <w:ind w:left="173" w:right="173"/>
+        <w:shd w:val="clear" w:fill="F3F3F3"/>
+      </w:pPr>
+      <w:r>
+        <w:rPr>
+          <w:rFonts w:ascii="Consolas" w:hAnsi="Consolas" w:cs="Consolas"/>
+          <w:sz w:val="15"/>
+        </w:rPr>
+        <w:t xml:space="preserve">                + "   &lt;-- what was SET, even if dropped");</w:t>
+      </w:r>
+    </w:p>
+    <w:p>
+      <w:pPr>
+        <w:spacing w:after="0"/>
+        <w:ind w:left="173" w:right="173"/>
+        <w:shd w:val="clear" w:fill="F3F3F3"/>
+      </w:pPr>
+    </w:p>
+    <w:p>
+      <w:pPr>
+        <w:spacing w:after="0"/>
+        <w:ind w:left="173" w:right="173"/>
+        <w:shd w:val="clear" w:fill="F3F3F3"/>
+      </w:pPr>
+      <w:r>
+        <w:rPr>
+          <w:rFonts w:ascii="Consolas" w:hAnsi="Consolas" w:cs="Consolas"/>
+          <w:sz w:val="15"/>
+        </w:rPr>
+        <w:t xml:space="preserve">        engine.beginHandshake();</w:t>
+      </w:r>
+    </w:p>
+    <w:p>
+      <w:pPr>
+        <w:spacing w:after="0"/>
+        <w:ind w:left="173" w:right="173"/>
+        <w:shd w:val="clear" w:fill="F3F3F3"/>
+      </w:pPr>
+      <w:r>
+        <w:rPr>
+          <w:rFonts w:ascii="Consolas" w:hAnsi="Consolas" w:cs="Consolas"/>
+          <w:sz w:val="15"/>
+        </w:rPr>
+        <w:t xml:space="preserve">        ByteBuffer net = ByteBuffer.allocate(engine.getSession().getPacketBufferSize());</w:t>
+      </w:r>
+    </w:p>
+    <w:p>
+      <w:pPr>
+        <w:spacing w:after="0"/>
+        <w:ind w:left="173" w:right="173"/>
+        <w:shd w:val="clear" w:fill="F3F3F3"/>
+      </w:pPr>
+      <w:r>
+        <w:rPr>
+          <w:rFonts w:ascii="Consolas" w:hAnsi="Consolas" w:cs="Consolas"/>
+          <w:sz w:val="15"/>
+        </w:rPr>
+        <w:t xml:space="preserve">        SSLEngineResult res = engine.wrap(ByteBuffer.allocate(0), net);</w:t>
+      </w:r>
+    </w:p>
+    <w:p>
+      <w:pPr>
+        <w:spacing w:after="0"/>
+        <w:ind w:left="173" w:right="173"/>
+        <w:shd w:val="clear" w:fill="F3F3F3"/>
+      </w:pPr>
+      <w:r>
+        <w:rPr>
+          <w:rFonts w:ascii="Consolas" w:hAnsi="Consolas" w:cs="Consolas"/>
+          <w:sz w:val="15"/>
+        </w:rPr>
+        <w:t xml:space="preserve">        System.out.println("ClientHello produced: " + res.getStatus() + ", " + net.position()</w:t>
+      </w:r>
+    </w:p>
+    <w:p>
+      <w:pPr>
+        <w:spacing w:after="0"/>
+        <w:ind w:left="173" w:right="173"/>
+        <w:shd w:val="clear" w:fill="F3F3F3"/>
+      </w:pPr>
+      <w:r>
+        <w:rPr>
+          <w:rFonts w:ascii="Consolas" w:hAnsi="Consolas" w:cs="Consolas"/>
+          <w:sz w:val="15"/>
+        </w:rPr>
+        <w:t xml:space="preserve">                + " bytes, NO exception");</w:t>
+      </w:r>
+    </w:p>
+    <w:p>
+      <w:pPr>
+        <w:spacing w:after="0"/>
+        <w:ind w:left="173" w:right="173"/>
+        <w:shd w:val="clear" w:fill="F3F3F3"/>
+      </w:pPr>
+    </w:p>
+    <w:p>
+      <w:pPr>
+        <w:spacing w:after="0"/>
+        <w:ind w:left="173" w:right="173"/>
+        <w:shd w:val="clear" w:fill="F3F3F3"/>
+      </w:pPr>
+      <w:r>
+        <w:rPr>
+          <w:rFonts w:ascii="Consolas" w:hAnsi="Consolas" w:cs="Consolas"/>
+          <w:sz w:val="15"/>
+        </w:rPr>
+        <w:t xml:space="preserve">        // Control: unsupported PROTOCOL on the same API family fails fast.</w:t>
+      </w:r>
+    </w:p>
+    <w:p>
+      <w:pPr>
+        <w:spacing w:after="0"/>
+        <w:ind w:left="173" w:right="173"/>
+        <w:shd w:val="clear" w:fill="F3F3F3"/>
+      </w:pPr>
+      <w:r>
+        <w:rPr>
+          <w:rFonts w:ascii="Consolas" w:hAnsi="Consolas" w:cs="Consolas"/>
+          <w:sz w:val="15"/>
+        </w:rPr>
+        <w:t xml:space="preserve">        String control;</w:t>
+      </w:r>
+    </w:p>
+    <w:p>
+      <w:pPr>
+        <w:spacing w:after="0"/>
+        <w:ind w:left="173" w:right="173"/>
+        <w:shd w:val="clear" w:fill="F3F3F3"/>
+      </w:pPr>
+      <w:r>
+        <w:rPr>
+          <w:rFonts w:ascii="Consolas" w:hAnsi="Consolas" w:cs="Consolas"/>
+          <w:sz w:val="15"/>
+        </w:rPr>
+        <w:t xml:space="preserve">        try {</w:t>
+      </w:r>
+    </w:p>
+    <w:p>
+      <w:pPr>
+        <w:spacing w:after="0"/>
+        <w:ind w:left="173" w:right="173"/>
+        <w:shd w:val="clear" w:fill="F3F3F3"/>
+      </w:pPr>
+      <w:r>
+        <w:rPr>
+          <w:rFonts w:ascii="Consolas" w:hAnsi="Consolas" w:cs="Consolas"/>
+          <w:sz w:val="15"/>
+        </w:rPr>
+        <w:t xml:space="preserve">            ctx.createSSLEngine().setEnabledProtocols(new String[] {"TLSv9.9"});</w:t>
+      </w:r>
+    </w:p>
+    <w:p>
+      <w:pPr>
+        <w:spacing w:after="0"/>
+        <w:ind w:left="173" w:right="173"/>
+        <w:shd w:val="clear" w:fill="F3F3F3"/>
+      </w:pPr>
+      <w:r>
+        <w:rPr>
+          <w:rFonts w:ascii="Consolas" w:hAnsi="Consolas" w:cs="Consolas"/>
+          <w:sz w:val="15"/>
+        </w:rPr>
+        <w:t xml:space="preserve">            control = "accepted, NO exception (unexpected)";</w:t>
+      </w:r>
+    </w:p>
+    <w:p>
+      <w:pPr>
+        <w:spacing w:after="0"/>
+        <w:ind w:left="173" w:right="173"/>
+        <w:shd w:val="clear" w:fill="F3F3F3"/>
+      </w:pPr>
+      <w:r>
+        <w:rPr>
+          <w:rFonts w:ascii="Consolas" w:hAnsi="Consolas" w:cs="Consolas"/>
+          <w:sz w:val="15"/>
+        </w:rPr>
+        <w:t xml:space="preserve">        } catch (IllegalArgumentException e) {</w:t>
+      </w:r>
+    </w:p>
+    <w:p>
+      <w:pPr>
+        <w:spacing w:after="0"/>
+        <w:ind w:left="173" w:right="173"/>
+        <w:shd w:val="clear" w:fill="F3F3F3"/>
+      </w:pPr>
+      <w:r>
+        <w:rPr>
+          <w:rFonts w:ascii="Consolas" w:hAnsi="Consolas" w:cs="Consolas"/>
+          <w:sz w:val="15"/>
+        </w:rPr>
+        <w:t xml:space="preserve">            control = "threw IllegalArgumentException: " + e.getMessage();</w:t>
       </w:r>
     </w:p>
     <w:p>
@@ -823,8 +1299,15 @@
           <w:rFonts w:ascii="Consolas" w:hAnsi="Consolas" w:cs="Consolas"/>
           <w:sz w:val="15"/>
         </w:rPr>
-        <w:t xml:space="preserve">    }</w:t>
+        <w:t xml:space="preserve">        System.out.println("Control setEnabledProtocols(TLSv9.9): " + control);</w:t>
       </w:r>
+    </w:p>
+    <w:p>
+      <w:pPr>
+        <w:spacing w:after="0"/>
+        <w:ind w:left="173" w:right="173"/>
+        <w:shd w:val="clear" w:fill="F3F3F3"/>
+      </w:pPr>
     </w:p>
     <w:p>
       <w:pPr>
@@ -837,7 +1320,7 @@
           <w:rFonts w:ascii="Consolas" w:hAnsi="Consolas" w:cs="Consolas"/>
           <w:sz w:val="15"/>
         </w:rPr>
-        <w:t>}</w:t>
+        <w:t xml:space="preserve">        System.out.println();</w:t>
       </w:r>
     </w:p>
     <w:p>
@@ -851,8 +1334,183 @@
           <w:rFonts w:ascii="Consolas" w:hAnsi="Consolas" w:cs="Consolas"/>
           <w:sz w:val="15"/>
         </w:rPr>
-        <w:t xml:space="preserve"> </w:t>
+        <w:t xml:space="preserve">        if (!dropped.isEmpty()) {</w:t>
       </w:r>
+    </w:p>
+    <w:p>
+      <w:pPr>
+        <w:spacing w:after="0"/>
+        <w:ind w:left="173" w:right="173"/>
+        <w:shd w:val="clear" w:fill="F3F3F3"/>
+      </w:pPr>
+      <w:r>
+        <w:rPr>
+          <w:rFonts w:ascii="Consolas" w:hAnsi="Consolas" w:cs="Consolas"/>
+          <w:sz w:val="15"/>
+        </w:rPr>
+        <w:t xml:space="preserve">            System.out.println("=&gt; Unsupported named group(s) " + dropped + " were silently accepted and");</w:t>
+      </w:r>
+    </w:p>
+    <w:p>
+      <w:pPr>
+        <w:spacing w:after="0"/>
+        <w:ind w:left="173" w:right="173"/>
+        <w:shd w:val="clear" w:fill="F3F3F3"/>
+      </w:pPr>
+      <w:r>
+        <w:rPr>
+          <w:rFonts w:ascii="Consolas" w:hAnsi="Consolas" w:cs="Consolas"/>
+          <w:sz w:val="15"/>
+        </w:rPr>
+        <w:t xml:space="preserve">            System.out.println("   dropped from the ClientHello; an unsupported protocol throws immediately.");</w:t>
+      </w:r>
+    </w:p>
+    <w:p>
+      <w:pPr>
+        <w:spacing w:after="0"/>
+        <w:ind w:left="173" w:right="173"/>
+        <w:shd w:val="clear" w:fill="F3F3F3"/>
+      </w:pPr>
+      <w:r>
+        <w:rPr>
+          <w:rFonts w:ascii="Consolas" w:hAnsi="Consolas" w:cs="Consolas"/>
+          <w:sz w:val="15"/>
+        </w:rPr>
+        <w:t xml:space="preserve">            System.out.println("   Only evidence: -Djavax.net.debug=ssl:handshake 2&gt;&amp;1 | grep \"named group\"");</w:t>
+      </w:r>
+    </w:p>
+    <w:p>
+      <w:pPr>
+        <w:spacing w:after="0"/>
+        <w:ind w:left="173" w:right="173"/>
+        <w:shd w:val="clear" w:fill="F3F3F3"/>
+      </w:pPr>
+      <w:r>
+        <w:rPr>
+          <w:rFonts w:ascii="Consolas" w:hAnsi="Consolas" w:cs="Consolas"/>
+          <w:sz w:val="15"/>
+        </w:rPr>
+        <w:t xml:space="preserve">        } else if (supported == null) {</w:t>
+      </w:r>
+    </w:p>
+    <w:p>
+      <w:pPr>
+        <w:spacing w:after="0"/>
+        <w:ind w:left="173" w:right="173"/>
+        <w:shd w:val="clear" w:fill="F3F3F3"/>
+      </w:pPr>
+      <w:r>
+        <w:rPr>
+          <w:rFonts w:ascii="Consolas" w:hAnsi="Consolas" w:cs="Consolas"/>
+          <w:sz w:val="15"/>
+        </w:rPr>
+        <w:t xml:space="preserve">            System.out.println("=&gt; This JDK does not enumerate supported groups (getNamedGroups()==null);");</w:t>
+      </w:r>
+    </w:p>
+    <w:p>
+      <w:pPr>
+        <w:spacing w:after="0"/>
+        <w:ind w:left="173" w:right="173"/>
+        <w:shd w:val="clear" w:fill="F3F3F3"/>
+      </w:pPr>
+      <w:r>
+        <w:rPr>
+          <w:rFonts w:ascii="Consolas" w:hAnsi="Consolas" w:cs="Consolas"/>
+          <w:sz w:val="15"/>
+        </w:rPr>
+        <w:t xml:space="preserve">            System.out.println("   run with -Djavax.net.debug=ssl:handshake and grep \"named group\" to see drops.");</w:t>
+      </w:r>
+    </w:p>
+    <w:p>
+      <w:pPr>
+        <w:spacing w:after="0"/>
+        <w:ind w:left="173" w:right="173"/>
+        <w:shd w:val="clear" w:fill="F3F3F3"/>
+      </w:pPr>
+      <w:r>
+        <w:rPr>
+          <w:rFonts w:ascii="Consolas" w:hAnsi="Consolas" w:cs="Consolas"/>
+          <w:sz w:val="15"/>
+        </w:rPr>
+        <w:t xml:space="preserve">        } else {</w:t>
+      </w:r>
+    </w:p>
+    <w:p>
+      <w:pPr>
+        <w:spacing w:after="0"/>
+        <w:ind w:left="173" w:right="173"/>
+        <w:shd w:val="clear" w:fill="F3F3F3"/>
+      </w:pPr>
+      <w:r>
+        <w:rPr>
+          <w:rFonts w:ascii="Consolas" w:hAnsi="Consolas" w:cs="Consolas"/>
+          <w:sz w:val="15"/>
+        </w:rPr>
+        <w:t xml:space="preserve">            System.out.println("=&gt; All requested groups are supported on this JDK; nothing was dropped here.");</w:t>
+      </w:r>
+    </w:p>
+    <w:p>
+      <w:pPr>
+        <w:spacing w:after="0"/>
+        <w:ind w:left="173" w:right="173"/>
+        <w:shd w:val="clear" w:fill="F3F3F3"/>
+      </w:pPr>
+      <w:r>
+        <w:rPr>
+          <w:rFonts w:ascii="Consolas" w:hAnsi="Consolas" w:cs="Consolas"/>
+          <w:sz w:val="15"/>
+        </w:rPr>
+        <w:t xml:space="preserve">            System.out.println("   Try: java src/SilentDropRepro.java MLKEM768,x25519   (unsupported even on JDK 27 EA)");</w:t>
+      </w:r>
+    </w:p>
+    <w:p>
+      <w:pPr>
+        <w:spacing w:after="0"/>
+        <w:ind w:left="173" w:right="173"/>
+        <w:shd w:val="clear" w:fill="F3F3F3"/>
+      </w:pPr>
+      <w:r>
+        <w:rPr>
+          <w:rFonts w:ascii="Consolas" w:hAnsi="Consolas" w:cs="Consolas"/>
+          <w:sz w:val="15"/>
+        </w:rPr>
+        <w:t xml:space="preserve">        }</w:t>
+      </w:r>
+    </w:p>
+    <w:p>
+      <w:pPr>
+        <w:spacing w:after="0"/>
+        <w:ind w:left="173" w:right="173"/>
+        <w:shd w:val="clear" w:fill="F3F3F3"/>
+      </w:pPr>
+      <w:r>
+        <w:rPr>
+          <w:rFonts w:ascii="Consolas" w:hAnsi="Consolas" w:cs="Consolas"/>
+          <w:sz w:val="15"/>
+        </w:rPr>
+        <w:t xml:space="preserve">    }</w:t>
+      </w:r>
+    </w:p>
+    <w:p>
+      <w:pPr>
+        <w:spacing w:after="0"/>
+        <w:ind w:left="173" w:right="173"/>
+        <w:shd w:val="clear" w:fill="F3F3F3"/>
+      </w:pPr>
+      <w:r>
+        <w:rPr>
+          <w:rFonts w:ascii="Consolas" w:hAnsi="Consolas" w:cs="Consolas"/>
+          <w:sz w:val="15"/>
+        </w:rPr>
+        <w:t xml:space="preserve">}</w:t>
+      </w:r>
+    </w:p>
+    <w:p>
+      <w:pPr>
+        <w:spacing w:after="0"/>
+        <w:ind w:left="173" w:right="173"/>
+        <w:shd w:val="clear" w:fill="F3F3F3"/>
+      </w:pPr>
     </w:p>
     <w:p>
       <w:pPr>

</xml_diff>